<commit_message>
Finish the core flashcard deck: 165 cards in 7 units with 50 diagrams
Units 05-07 reviewed (exports, standard and landed cost, owning a tool;
track deep dives, tariff mechanics, data mapping and UAT; drawback,
e2open migration, reporting). Final cross-unit pass: no near-duplicate
questions; each unit's worked examples now use their own fictional item
(KIT-200/300/400, PUMP-50) so numbers never conflict; the Unit 03 de
minimis answer no longer reveals the next card's RVC result.

dist/BSA-Onboarding.apkg: 165 core cards (unit and group subdecks) and
180 suspended Reference cards, 162 images, 8.5 MB.

Co-Authored-By: Claude Opus 5.5 <noreply@anthropic.com>
Claude-Session: https://claude.ai/code/session_01HYPr12gJ7yT998qrKuSZbE
</commit_message>
<xml_diff>
--- a/dist/docs/templates/knowledge/anki-card-writing-guide.docx
+++ b/dist/docs/templates/knowledge/anki-card-writing-guide.docx
@@ -2,7 +2,7 @@
 <file path=word/document.xml><?xml version="1.0" encoding="utf-8"?>
 <w:document xmlns:w="http://schemas.openxmlformats.org/wordprocessingml/2006/main" xmlns:m="http://schemas.openxmlformats.org/officeDocument/2006/math" xmlns:r="http://schemas.openxmlformats.org/officeDocument/2006/relationships" xmlns:o="urn:schemas-microsoft-com:office:office" xmlns:v="urn:schemas-microsoft-com:vml" xmlns:w10="urn:schemas-microsoft-com:office:word" xmlns:a="http://schemas.openxmlformats.org/drawingml/2006/main" xmlns:pic="http://schemas.openxmlformats.org/drawingml/2006/picture" xmlns:wp="http://schemas.openxmlformats.org/drawingml/2006/wordprocessingDrawing">
   <w:body>
-    <w:bookmarkStart w:id="29" w:name="anki-card-writing-guide"/>
+    <w:bookmarkStart w:id="30" w:name="anki-card-writing-guide"/>
     <w:p>
       <w:pPr>
         <w:pStyle w:val="Heading1"/>
@@ -121,10 +121,10 @@
         <w:tblLayout w:type="fixed"/>
       </w:tblPr>
       <w:tblGrid>
-        <w:gridCol w:w="1291"/>
-        <w:gridCol w:w="3078"/>
-        <w:gridCol w:w="2664"/>
-        <w:gridCol w:w="2325"/>
+        <w:gridCol w:w="1432"/>
+        <w:gridCol w:w="3117"/>
+        <w:gridCol w:w="2568"/>
+        <w:gridCol w:w="2241"/>
       </w:tblGrid>
       <w:tr>
         <w:trPr>
@@ -132,7 +132,7 @@
         </w:trPr>
         <w:tc>
           <w:tcPr>
-            <w:tcW w:w="1291" w:type="dxa"/>
+            <w:tcW w:w="1432" w:type="dxa"/>
           </w:tcPr>
           <w:p>
             <w:pPr>
@@ -146,7 +146,7 @@
         </w:tc>
         <w:tc>
           <w:tcPr>
-            <w:tcW w:w="3078" w:type="dxa"/>
+            <w:tcW w:w="3117" w:type="dxa"/>
           </w:tcPr>
           <w:p>
             <w:pPr>
@@ -160,7 +160,7 @@
         </w:tc>
         <w:tc>
           <w:tcPr>
-            <w:tcW w:w="2664" w:type="dxa"/>
+            <w:tcW w:w="2568" w:type="dxa"/>
           </w:tcPr>
           <w:p>
             <w:pPr>
@@ -174,7 +174,7 @@
         </w:tc>
         <w:tc>
           <w:tcPr>
-            <w:tcW w:w="2325" w:type="dxa"/>
+            <w:tcW w:w="2241" w:type="dxa"/>
           </w:tcPr>
           <w:p>
             <w:pPr>
@@ -190,35 +190,35 @@
       <w:tr>
         <w:tc>
           <w:tcPr>
-            <w:tcW w:w="1291" w:type="dxa"/>
-          </w:tcPr>
-          <w:p>
-            <w:pPr>
-              <w:pStyle w:val="Compact"/>
-              <w:jc w:val="left"/>
-            </w:pPr>
-            <w:r>
-              <w:t xml:space="preserve">Team deck: "BSA Onboarding" (3 sub-decks)</w:t>
-            </w:r>
-          </w:p>
-        </w:tc>
-        <w:tc>
-          <w:tcPr>
-            <w:tcW w:w="3078" w:type="dxa"/>
-          </w:tcPr>
-          <w:p>
-            <w:pPr>
-              <w:pStyle w:val="Compact"/>
-              <w:jc w:val="left"/>
-            </w:pPr>
-            <w:r>
-              <w:t xml:space="preserve">Industry and regulatory knowledge, BSA craft and data skills. Nothing company-specific</w:t>
-            </w:r>
-          </w:p>
-        </w:tc>
-        <w:tc>
-          <w:tcPr>
-            <w:tcW w:w="2664" w:type="dxa"/>
+            <w:tcW w:w="1432" w:type="dxa"/>
+          </w:tcPr>
+          <w:p>
+            <w:pPr>
+              <w:pStyle w:val="Compact"/>
+              <w:jc w:val="left"/>
+            </w:pPr>
+            <w:r>
+              <w:t xml:space="preserve">Team deck: "BSA Onboarding" (Units 01–07 plus Reference)</w:t>
+            </w:r>
+          </w:p>
+        </w:tc>
+        <w:tc>
+          <w:tcPr>
+            <w:tcW w:w="3117" w:type="dxa"/>
+          </w:tcPr>
+          <w:p>
+            <w:pPr>
+              <w:pStyle w:val="Compact"/>
+              <w:jc w:val="left"/>
+            </w:pPr>
+            <w:r>
+              <w:t xml:space="preserve">Industry and regulatory knowledge, program rules, BSA craft and data skills, with diagrams. Nothing company-specific</w:t>
+            </w:r>
+          </w:p>
+        </w:tc>
+        <w:tc>
+          <w:tcPr>
+            <w:tcW w:w="2568" w:type="dxa"/>
           </w:tcPr>
           <w:p>
             <w:pPr>
@@ -232,7 +232,7 @@
         </w:tc>
         <w:tc>
           <w:tcPr>
-            <w:tcW w:w="2325" w:type="dxa"/>
+            <w:tcW w:w="2241" w:type="dxa"/>
           </w:tcPr>
           <w:p>
             <w:pPr>
@@ -248,7 +248,7 @@
       <w:tr>
         <w:tc>
           <w:tcPr>
-            <w:tcW w:w="1291" w:type="dxa"/>
+            <w:tcW w:w="1432" w:type="dxa"/>
           </w:tcPr>
           <w:p>
             <w:pPr>
@@ -262,7 +262,7 @@
         </w:tc>
         <w:tc>
           <w:tcPr>
-            <w:tcW w:w="3078" w:type="dxa"/>
+            <w:tcW w:w="3117" w:type="dxa"/>
           </w:tcPr>
           <w:p>
             <w:pPr>
@@ -300,7 +300,7 @@
         </w:tc>
         <w:tc>
           <w:tcPr>
-            <w:tcW w:w="2664" w:type="dxa"/>
+            <w:tcW w:w="2568" w:type="dxa"/>
           </w:tcPr>
           <w:p>
             <w:pPr>
@@ -314,7 +314,7 @@
         </w:tc>
         <w:tc>
           <w:tcPr>
-            <w:tcW w:w="2325" w:type="dxa"/>
+            <w:tcW w:w="2241" w:type="dxa"/>
           </w:tcPr>
           <w:p>
             <w:pPr>
@@ -394,13 +394,13 @@
       </w:r>
     </w:p>
     <w:bookmarkEnd w:id="20"/>
-    <w:bookmarkStart w:id="21" w:name="principles"/>
+    <w:bookmarkStart w:id="21" w:name="how-the-team-deck-is-organized"/>
     <w:p>
       <w:pPr>
         <w:pStyle w:val="Heading2"/>
       </w:pPr>
       <w:r>
-        <w:t xml:space="preserve">Principles</w:t>
+        <w:t xml:space="preserve">How the team deck is organized</w:t>
       </w:r>
     </w:p>
     <w:p>
@@ -416,13 +416,13 @@
           <w:bCs/>
           <w:b/>
         </w:rPr>
-        <w:t xml:space="preserve">Atomic: one fact per card.</w:t>
-      </w:r>
-      <w:r>
-        <w:t xml:space="preserve"> </w:t>
-      </w:r>
-      <w:r>
-        <w:t xml:space="preserve">If the back has "and" joining two facts, make two cards.</w:t>
+        <w:t xml:space="preserve">Units follow the teaching order.</w:t>
+      </w:r>
+      <w:r>
+        <w:t xml:space="preserve"> </w:t>
+      </w:r>
+      <w:r>
+        <w:t xml:space="preserve">Unit 01 is Week 1, Unit 02 Week 2, Unit 03 Week 3, Unit 04 Week 4, Unit 05 Weeks 5–6, Unit 06 Weeks 7–9 and Unit 07 Weeks 10–13. Each unit has topic groups, for example Unit 02 › 3 Classification (HS, HTS, GRIs).</w:t>
       </w:r>
     </w:p>
     <w:p>
@@ -438,13 +438,67 @@
           <w:bCs/>
           <w:b/>
         </w:rPr>
-        <w:t xml:space="preserve">Question on the front.</w:t>
-      </w:r>
-      <w:r>
-        <w:t xml:space="preserve"> </w:t>
-      </w:r>
-      <w:r>
-        <w:t xml:space="preserve">A real question you could be asked at work, with enough context to have one right answer. Put the country first when rules differ: "US: ...", "CA: ...", "MX: ...".</w:t>
+        <w:t xml:space="preserve">Priority and track tags.</w:t>
+      </w:r>
+      <w:r>
+        <w:t xml:space="preserve"> </w:t>
+      </w:r>
+      <w:r>
+        <w:rPr>
+          <w:rStyle w:val="VerbatimChar"/>
+        </w:rPr>
+        <w:t xml:space="preserve">priority::1</w:t>
+      </w:r>
+      <w:r>
+        <w:t xml:space="preserve"> </w:t>
+      </w:r>
+      <w:r>
+        <w:t xml:space="preserve">cards are must-know by the end of that week;</w:t>
+      </w:r>
+      <w:r>
+        <w:t xml:space="preserve"> </w:t>
+      </w:r>
+      <w:r>
+        <w:rPr>
+          <w:rStyle w:val="VerbatimChar"/>
+        </w:rPr>
+        <w:t xml:space="preserve">priority::2</w:t>
+      </w:r>
+      <w:r>
+        <w:t xml:space="preserve"> </w:t>
+      </w:r>
+      <w:r>
+        <w:t xml:space="preserve">are should-know. Cards tagged</w:t>
+      </w:r>
+      <w:r>
+        <w:t xml:space="preserve"> </w:t>
+      </w:r>
+      <w:r>
+        <w:rPr>
+          <w:rStyle w:val="VerbatimChar"/>
+        </w:rPr>
+        <w:t xml:space="preserve">track::research</w:t>
+      </w:r>
+      <w:r>
+        <w:t xml:space="preserve"> </w:t>
+      </w:r>
+      <w:r>
+        <w:t xml:space="preserve">or</w:t>
+      </w:r>
+      <w:r>
+        <w:t xml:space="preserve"> </w:t>
+      </w:r>
+      <w:r>
+        <w:rPr>
+          <w:rStyle w:val="VerbatimChar"/>
+        </w:rPr>
+        <w:t xml:space="preserve">track::stdcost</w:t>
+      </w:r>
+      <w:r>
+        <w:t xml:space="preserve"> </w:t>
+      </w:r>
+      <w:r>
+        <w:t xml:space="preserve">belong to one track: do yours properly and skim the other.</w:t>
       </w:r>
     </w:p>
     <w:p>
@@ -460,13 +514,13 @@
           <w:bCs/>
           <w:b/>
         </w:rPr>
-        <w:t xml:space="preserve">Short back: 40 words or fewer.</w:t>
-      </w:r>
-      <w:r>
-        <w:t xml:space="preserve"> </w:t>
-      </w:r>
-      <w:r>
-        <w:t xml:space="preserve">The answer first, then at most one line of why or source.</w:t>
+        <w:t xml:space="preserve">Four kinds of card.</w:t>
+      </w:r>
+      <w:r>
+        <w:t xml:space="preserve"> </w:t>
+      </w:r>
+      <w:r>
+        <w:t xml:space="preserve">Plain question cards; diagram cards, whose answer shows a diagram; fill-in-the-diagram cards, where the front hides one label (say the answer out loud before you flip); and worked examples (do the arithmetic on paper first).</w:t>
       </w:r>
     </w:p>
     <w:p>
@@ -482,76 +536,66 @@
           <w:bCs/>
           <w:b/>
         </w:rPr>
-        <w:t xml:space="preserve">Basic or cloze?</w:t>
-      </w:r>
-      <w:r>
-        <w:t xml:space="preserve"> </w:t>
-      </w:r>
-      <w:r>
-        <w:t xml:space="preserve">Use basic (front and back) for "why", "who", "where to find" and definitions. Use cloze (fill in the blank) for a fixed phrase, a short sequence or one term inside a sentence. Never cloze more than one idea per card number.</w:t>
-      </w:r>
-    </w:p>
-    <w:p>
-      <w:pPr>
-        <w:numPr>
-          <w:ilvl w:val="0"/>
-          <w:numId w:val="1002"/>
-        </w:numPr>
-        <w:pStyle w:val="Compact"/>
+        <w:t xml:space="preserve">Reference (browse only).</w:t>
+      </w:r>
+      <w:r>
+        <w:t xml:space="preserve"> </w:t>
+      </w:r>
+      <w:r>
+        <w:t xml:space="preserve">The rest of the original cards, suspended so they stay out of your daily queue. To add one to your queue: Browse, select the card, then Cards &gt; Toggle Suspend.</w:t>
+      </w:r>
+    </w:p>
+    <w:p>
+      <w:pPr>
+        <w:pStyle w:val="FirstParagraph"/>
       </w:pPr>
       <w:r>
         <w:rPr>
           <w:bCs/>
           <w:b/>
         </w:rPr>
-        <w:t xml:space="preserve">Avoid volatile facts.</w:t>
-      </w:r>
-      <w:r>
-        <w:t xml:space="preserve"> </w:t>
-      </w:r>
-      <w:r>
-        <w:t xml:space="preserve">Tariff rates, fee amounts, thresholds, the current status of an action and system names change. Prefer a card on where to find the current value. If you must keep a fact that can change, tag the card</w:t>
-      </w:r>
-      <w:r>
-        <w:t xml:space="preserve"> </w:t>
-      </w:r>
-      <w:r>
-        <w:rPr>
-          <w:rStyle w:val="VerbatimChar"/>
-        </w:rPr>
-        <w:t xml:space="preserve">dated</w:t>
-      </w:r>
-      <w:r>
-        <w:t xml:space="preserve">, cite the source, and end the back with the month you checked it, for example "(as of Oct 2026)". The team deck uses the same convention. Update or delete the card when the fact changes.</w:t>
-      </w:r>
-    </w:p>
-    <w:p>
-      <w:pPr>
-        <w:numPr>
-          <w:ilvl w:val="0"/>
-          <w:numId w:val="1002"/>
-        </w:numPr>
-        <w:pStyle w:val="Compact"/>
+        <w:t xml:space="preserve">One-time setup (2 minutes).</w:t>
+      </w:r>
+      <w:r>
+        <w:t xml:space="preserve"> </w:t>
+      </w:r>
+      <w:r>
+        <w:t xml:space="preserve">On the Decks screen, click the gear next to "BSA Onboarding" &gt; Options. Under Daily Limits, set New cards/day to 10 on the preset tab, then switch to the "This deck" tab and set New cards/day to 0, and save. Leave "Limits start from top" off. The top deck now shows only reviews, and each unit you click gives up to 10 new cards a day (Anki applies the limits of the deck you click, not its parent's).</w:t>
+      </w:r>
+    </w:p>
+    <w:p>
+      <w:pPr>
+        <w:pStyle w:val="BodyText"/>
       </w:pPr>
       <w:r>
         <w:rPr>
           <w:bCs/>
           <w:b/>
         </w:rPr>
-        <w:t xml:space="preserve">Cite a source</w:t>
-      </w:r>
-      <w:r>
-        <w:t xml:space="preserve"> </w:t>
-      </w:r>
-      <w:r>
-        <w:t xml:space="preserve">in the Source field: primer section, regulation, SOP ID, brief ID, OneNote page. A card you cannot source is a question for the question log, not a card.</w:t>
-      </w:r>
-    </w:p>
-    <w:p>
-      <w:pPr>
-        <w:numPr>
-          <w:ilvl w:val="0"/>
-          <w:numId w:val="1002"/>
+        <w:t xml:space="preserve">Every day.</w:t>
+      </w:r>
+      <w:r>
+        <w:t xml:space="preserve"> </w:t>
+      </w:r>
+      <w:r>
+        <w:t xml:space="preserve">(1) Click the unit for the current week: learn its new cards and do its reviews. (2) Click "BSA Onboarding" to clear the remaining reviews from earlier units. (3) Study your own deck. If a unit's new cards run out before the week ends, use the spare minutes on your own cards; do not start next week's unit early.</w:t>
+      </w:r>
+    </w:p>
+    <w:bookmarkEnd w:id="21"/>
+    <w:bookmarkStart w:id="22" w:name="principles"/>
+    <w:p>
+      <w:pPr>
+        <w:pStyle w:val="Heading2"/>
+      </w:pPr>
+      <w:r>
+        <w:t xml:space="preserve">Principles</w:t>
+      </w:r>
+    </w:p>
+    <w:p>
+      <w:pPr>
+        <w:numPr>
+          <w:ilvl w:val="0"/>
+          <w:numId w:val="1003"/>
         </w:numPr>
         <w:pStyle w:val="Compact"/>
       </w:pPr>
@@ -560,20 +604,20 @@
           <w:bCs/>
           <w:b/>
         </w:rPr>
-        <w:t xml:space="preserve">Your own words,</w:t>
-      </w:r>
-      <w:r>
-        <w:t xml:space="preserve"> </w:t>
-      </w:r>
-      <w:r>
-        <w:t xml:space="preserve">not copied paragraphs. Writing the card is half the learning.</w:t>
-      </w:r>
-    </w:p>
-    <w:p>
-      <w:pPr>
-        <w:numPr>
-          <w:ilvl w:val="0"/>
-          <w:numId w:val="1002"/>
+        <w:t xml:space="preserve">Atomic: one fact per card.</w:t>
+      </w:r>
+      <w:r>
+        <w:t xml:space="preserve"> </w:t>
+      </w:r>
+      <w:r>
+        <w:t xml:space="preserve">If the back has "and" joining two facts, make two cards.</w:t>
+      </w:r>
+    </w:p>
+    <w:p>
+      <w:pPr>
+        <w:numPr>
+          <w:ilvl w:val="0"/>
+          <w:numId w:val="1003"/>
         </w:numPr>
         <w:pStyle w:val="Compact"/>
       </w:pPr>
@@ -582,20 +626,20 @@
           <w:bCs/>
           <w:b/>
         </w:rPr>
-        <w:t xml:space="preserve">No lists longer than 3.</w:t>
-      </w:r>
-      <w:r>
-        <w:t xml:space="preserve"> </w:t>
-      </w:r>
-      <w:r>
-        <w:t xml:space="preserve">Break them up or use cloze, one card per item. Exception: the team deck keeps a few fixed lists from a legal text or standard (for example the nine USMCA certification data elements or the five ECCN product groups) as numbered lists; every card you write follows rule 8.</w:t>
-      </w:r>
-    </w:p>
-    <w:p>
-      <w:pPr>
-        <w:numPr>
-          <w:ilvl w:val="0"/>
-          <w:numId w:val="1002"/>
+        <w:t xml:space="preserve">Question on the front.</w:t>
+      </w:r>
+      <w:r>
+        <w:t xml:space="preserve"> </w:t>
+      </w:r>
+      <w:r>
+        <w:t xml:space="preserve">A real question you could be asked at work, with enough context to have one right answer. Put the country first when rules differ: "US: ...", "CA: ...", "MX: ...".</w:t>
+      </w:r>
+    </w:p>
+    <w:p>
+      <w:pPr>
+        <w:numPr>
+          <w:ilvl w:val="0"/>
+          <w:numId w:val="1003"/>
         </w:numPr>
         <w:pStyle w:val="Compact"/>
       </w:pPr>
@@ -604,20 +648,20 @@
           <w:bCs/>
           <w:b/>
         </w:rPr>
-        <w:t xml:space="preserve">No yes or no questions.</w:t>
-      </w:r>
-      <w:r>
-        <w:t xml:space="preserve"> </w:t>
-      </w:r>
-      <w:r>
-        <w:t xml:space="preserve">Ask for the thing itself.</w:t>
-      </w:r>
-    </w:p>
-    <w:p>
-      <w:pPr>
-        <w:numPr>
-          <w:ilvl w:val="0"/>
-          <w:numId w:val="1002"/>
+        <w:t xml:space="preserve">Short back: 40 words or fewer.</w:t>
+      </w:r>
+      <w:r>
+        <w:t xml:space="preserve"> </w:t>
+      </w:r>
+      <w:r>
+        <w:t xml:space="preserve">The answer first, then at most one line of why or source.</w:t>
+      </w:r>
+    </w:p>
+    <w:p>
+      <w:pPr>
+        <w:numPr>
+          <w:ilvl w:val="0"/>
+          <w:numId w:val="1003"/>
         </w:numPr>
         <w:pStyle w:val="Compact"/>
       </w:pPr>
@@ -626,6 +670,150 @@
           <w:bCs/>
           <w:b/>
         </w:rPr>
+        <w:t xml:space="preserve">Basic or cloze?</w:t>
+      </w:r>
+      <w:r>
+        <w:t xml:space="preserve"> </w:t>
+      </w:r>
+      <w:r>
+        <w:t xml:space="preserve">Use basic (front and back) for "why", "who", "where to find" and definitions. Use cloze (fill in the blank) for a fixed phrase, a short sequence or one term inside a sentence. Never cloze more than one idea per card number.</w:t>
+      </w:r>
+    </w:p>
+    <w:p>
+      <w:pPr>
+        <w:numPr>
+          <w:ilvl w:val="0"/>
+          <w:numId w:val="1003"/>
+        </w:numPr>
+        <w:pStyle w:val="Compact"/>
+      </w:pPr>
+      <w:r>
+        <w:rPr>
+          <w:bCs/>
+          <w:b/>
+        </w:rPr>
+        <w:t xml:space="preserve">Avoid volatile facts.</w:t>
+      </w:r>
+      <w:r>
+        <w:t xml:space="preserve"> </w:t>
+      </w:r>
+      <w:r>
+        <w:t xml:space="preserve">Tariff rates, fee amounts, thresholds, the current status of an action and system names change. Prefer a card on where to find the current value. If you must keep a fact that can change, tag the card</w:t>
+      </w:r>
+      <w:r>
+        <w:t xml:space="preserve"> </w:t>
+      </w:r>
+      <w:r>
+        <w:rPr>
+          <w:rStyle w:val="VerbatimChar"/>
+        </w:rPr>
+        <w:t xml:space="preserve">dated</w:t>
+      </w:r>
+      <w:r>
+        <w:t xml:space="preserve">, cite the source, and end the back with the month you checked it, for example "(as of Oct 2026)". The team deck uses the same convention. Update or delete the card when the fact changes.</w:t>
+      </w:r>
+    </w:p>
+    <w:p>
+      <w:pPr>
+        <w:numPr>
+          <w:ilvl w:val="0"/>
+          <w:numId w:val="1003"/>
+        </w:numPr>
+        <w:pStyle w:val="Compact"/>
+      </w:pPr>
+      <w:r>
+        <w:rPr>
+          <w:bCs/>
+          <w:b/>
+        </w:rPr>
+        <w:t xml:space="preserve">Cite a source</w:t>
+      </w:r>
+      <w:r>
+        <w:t xml:space="preserve"> </w:t>
+      </w:r>
+      <w:r>
+        <w:t xml:space="preserve">in the Source field: primer section, regulation, SOP ID, brief ID, OneNote page. A card you cannot source is a question for the question log, not a card.</w:t>
+      </w:r>
+    </w:p>
+    <w:p>
+      <w:pPr>
+        <w:numPr>
+          <w:ilvl w:val="0"/>
+          <w:numId w:val="1003"/>
+        </w:numPr>
+        <w:pStyle w:val="Compact"/>
+      </w:pPr>
+      <w:r>
+        <w:rPr>
+          <w:bCs/>
+          <w:b/>
+        </w:rPr>
+        <w:t xml:space="preserve">Your own words,</w:t>
+      </w:r>
+      <w:r>
+        <w:t xml:space="preserve"> </w:t>
+      </w:r>
+      <w:r>
+        <w:t xml:space="preserve">not copied paragraphs. Writing the card is half the learning.</w:t>
+      </w:r>
+    </w:p>
+    <w:p>
+      <w:pPr>
+        <w:numPr>
+          <w:ilvl w:val="0"/>
+          <w:numId w:val="1003"/>
+        </w:numPr>
+        <w:pStyle w:val="Compact"/>
+      </w:pPr>
+      <w:r>
+        <w:rPr>
+          <w:bCs/>
+          <w:b/>
+        </w:rPr>
+        <w:t xml:space="preserve">No lists longer than 3.</w:t>
+      </w:r>
+      <w:r>
+        <w:t xml:space="preserve"> </w:t>
+      </w:r>
+      <w:r>
+        <w:t xml:space="preserve">Break them up or use cloze, one card per item. Exception: the team deck keeps a few fixed lists from a legal text or standard (for example the nine USMCA certification data elements or the five ECCN product groups) as numbered lists; every card you write follows rule 8.</w:t>
+      </w:r>
+    </w:p>
+    <w:p>
+      <w:pPr>
+        <w:numPr>
+          <w:ilvl w:val="0"/>
+          <w:numId w:val="1003"/>
+        </w:numPr>
+        <w:pStyle w:val="Compact"/>
+      </w:pPr>
+      <w:r>
+        <w:rPr>
+          <w:bCs/>
+          <w:b/>
+        </w:rPr>
+        <w:t xml:space="preserve">No yes or no questions.</w:t>
+      </w:r>
+      <w:r>
+        <w:t xml:space="preserve"> </w:t>
+      </w:r>
+      <w:r>
+        <w:t xml:space="preserve">Ask for the thing itself.</w:t>
+      </w:r>
+    </w:p>
+    <w:p>
+      <w:pPr>
+        <w:numPr>
+          <w:ilvl w:val="0"/>
+          <w:numId w:val="1003"/>
+        </w:numPr>
+        <w:pStyle w:val="Compact"/>
+      </w:pPr>
+      <w:r>
+        <w:rPr>
+          <w:bCs/>
+          <w:b/>
+        </w:rPr>
         <w:t xml:space="preserve">Fix or suspend bad cards.</w:t>
       </w:r>
       <w:r>
@@ -635,8 +823,8 @@
         <w:t xml:space="preserve">A card you keep failing is badly written more often than it is hard. Rewrite it.</w:t>
       </w:r>
     </w:p>
-    <w:bookmarkEnd w:id="21"/>
-    <w:bookmarkStart w:id="22" w:name="good-and-bad-examples-from-our-domain"/>
+    <w:bookmarkEnd w:id="22"/>
+    <w:bookmarkStart w:id="23" w:name="good-and-bad-examples-from-our-domain"/>
     <w:p>
       <w:pPr>
         <w:pStyle w:val="Heading2"/>
@@ -1070,7 +1258,7 @@
       <w:pPr>
         <w:numPr>
           <w:ilvl w:val="0"/>
-          <w:numId w:val="1003"/>
+          <w:numId w:val="1004"/>
         </w:numPr>
         <w:pStyle w:val="Compact"/>
       </w:pPr>
@@ -1082,7 +1270,7 @@
       <w:pPr>
         <w:numPr>
           <w:ilvl w:val="0"/>
-          <w:numId w:val="1003"/>
+          <w:numId w:val="1004"/>
         </w:numPr>
         <w:pStyle w:val="Compact"/>
       </w:pPr>
@@ -1094,7 +1282,7 @@
       <w:pPr>
         <w:numPr>
           <w:ilvl w:val="0"/>
-          <w:numId w:val="1003"/>
+          <w:numId w:val="1004"/>
         </w:numPr>
         <w:pStyle w:val="Compact"/>
       </w:pPr>
@@ -1114,8 +1302,8 @@
         <w:t xml:space="preserve">.</w:t>
       </w:r>
     </w:p>
-    <w:bookmarkEnd w:id="22"/>
-    <w:bookmarkStart w:id="23" w:name="tag-convention"/>
+    <w:bookmarkEnd w:id="23"/>
+    <w:bookmarkStart w:id="24" w:name="tag-convention"/>
     <w:p>
       <w:pPr>
         <w:pStyle w:val="Heading2"/>
@@ -1136,7 +1324,7 @@
       <w:pPr>
         <w:numPr>
           <w:ilvl w:val="0"/>
-          <w:numId w:val="1004"/>
+          <w:numId w:val="1005"/>
         </w:numPr>
         <w:pStyle w:val="Compact"/>
       </w:pPr>
@@ -1305,7 +1493,7 @@
       <w:pPr>
         <w:numPr>
           <w:ilvl w:val="0"/>
-          <w:numId w:val="1004"/>
+          <w:numId w:val="1005"/>
         </w:numPr>
         <w:pStyle w:val="Compact"/>
       </w:pPr>
@@ -1347,7 +1535,7 @@
       <w:pPr>
         <w:numPr>
           <w:ilvl w:val="0"/>
-          <w:numId w:val="1004"/>
+          <w:numId w:val="1005"/>
         </w:numPr>
         <w:pStyle w:val="Compact"/>
       </w:pPr>
@@ -1447,7 +1635,7 @@
       <w:pPr>
         <w:numPr>
           <w:ilvl w:val="0"/>
-          <w:numId w:val="1004"/>
+          <w:numId w:val="1005"/>
         </w:numPr>
         <w:pStyle w:val="Compact"/>
       </w:pPr>
@@ -1471,7 +1659,7 @@
       <w:pPr>
         <w:numPr>
           <w:ilvl w:val="0"/>
-          <w:numId w:val="1004"/>
+          <w:numId w:val="1005"/>
         </w:numPr>
         <w:pStyle w:val="Compact"/>
       </w:pPr>
@@ -1479,8 +1667,8 @@
         <w:t xml:space="preserve">Keep topic names short and reuse existing ones. Check the tag tree before you invent a new topic.</w:t>
       </w:r>
     </w:p>
-    <w:bookmarkEnd w:id="23"/>
-    <w:bookmarkStart w:id="24" w:name="daily-routine-15-minutes"/>
+    <w:bookmarkEnd w:id="24"/>
+    <w:bookmarkStart w:id="25" w:name="daily-routine-15-minutes"/>
     <w:p>
       <w:pPr>
         <w:pStyle w:val="Heading2"/>
@@ -1498,9 +1686,9 @@
         <w:tblLayout w:type="fixed"/>
       </w:tblPr>
       <w:tblGrid>
-        <w:gridCol w:w="1914"/>
-        <w:gridCol w:w="6328"/>
-        <w:gridCol w:w="1116"/>
+        <w:gridCol w:w="1865"/>
+        <w:gridCol w:w="6405"/>
+        <w:gridCol w:w="1088"/>
       </w:tblGrid>
       <w:tr>
         <w:trPr>
@@ -1508,7 +1696,7 @@
         </w:trPr>
         <w:tc>
           <w:tcPr>
-            <w:tcW w:w="1914" w:type="dxa"/>
+            <w:tcW w:w="1865" w:type="dxa"/>
           </w:tcPr>
           <w:p>
             <w:pPr>
@@ -1522,7 +1710,7 @@
         </w:tc>
         <w:tc>
           <w:tcPr>
-            <w:tcW w:w="6328" w:type="dxa"/>
+            <w:tcW w:w="6405" w:type="dxa"/>
           </w:tcPr>
           <w:p>
             <w:pPr>
@@ -1536,7 +1724,7 @@
         </w:tc>
         <w:tc>
           <w:tcPr>
-            <w:tcW w:w="1116" w:type="dxa"/>
+            <w:tcW w:w="1088" w:type="dxa"/>
           </w:tcPr>
           <w:p>
             <w:pPr>
@@ -1552,7 +1740,7 @@
       <w:tr>
         <w:tc>
           <w:tcPr>
-            <w:tcW w:w="1914" w:type="dxa"/>
+            <w:tcW w:w="1865" w:type="dxa"/>
           </w:tcPr>
           <w:p>
             <w:pPr>
@@ -1566,21 +1754,21 @@
         </w:tc>
         <w:tc>
           <w:tcPr>
-            <w:tcW w:w="6328" w:type="dxa"/>
-          </w:tcPr>
-          <w:p>
-            <w:pPr>
-              <w:pStyle w:val="Compact"/>
-              <w:jc w:val="left"/>
-            </w:pPr>
-            <w:r>
-              <w:t xml:space="preserve">Review all due cards in both decks. Reviews before new cards</w:t>
-            </w:r>
-          </w:p>
-        </w:tc>
-        <w:tc>
-          <w:tcPr>
-            <w:tcW w:w="1116" w:type="dxa"/>
+            <w:tcW w:w="6405" w:type="dxa"/>
+          </w:tcPr>
+          <w:p>
+            <w:pPr>
+              <w:pStyle w:val="Compact"/>
+              <w:jc w:val="left"/>
+            </w:pPr>
+            <w:r>
+              <w:t xml:space="preserve">Current unit (new cards and its reviews), then the top deck (remaining reviews), then your own deck</w:t>
+            </w:r>
+          </w:p>
+        </w:tc>
+        <w:tc>
+          <w:tcPr>
+            <w:tcW w:w="1088" w:type="dxa"/>
           </w:tcPr>
           <w:p>
             <w:pPr>
@@ -1596,7 +1784,7 @@
       <w:tr>
         <w:tc>
           <w:tcPr>
-            <w:tcW w:w="1914" w:type="dxa"/>
+            <w:tcW w:w="1865" w:type="dxa"/>
           </w:tcPr>
           <w:p>
             <w:pPr>
@@ -1610,7 +1798,7 @@
         </w:tc>
         <w:tc>
           <w:tcPr>
-            <w:tcW w:w="6328" w:type="dxa"/>
+            <w:tcW w:w="6405" w:type="dxa"/>
           </w:tcPr>
           <w:p>
             <w:pPr>
@@ -1624,7 +1812,7 @@
         </w:tc>
         <w:tc>
           <w:tcPr>
-            <w:tcW w:w="1116" w:type="dxa"/>
+            <w:tcW w:w="1088" w:type="dxa"/>
           </w:tcPr>
           <w:p>
             <w:pPr>
@@ -1640,7 +1828,7 @@
       <w:tr>
         <w:tc>
           <w:tcPr>
-            <w:tcW w:w="1914" w:type="dxa"/>
+            <w:tcW w:w="1865" w:type="dxa"/>
           </w:tcPr>
           <w:p>
             <w:pPr>
@@ -1654,7 +1842,7 @@
         </w:tc>
         <w:tc>
           <w:tcPr>
-            <w:tcW w:w="6328" w:type="dxa"/>
+            <w:tcW w:w="6405" w:type="dxa"/>
           </w:tcPr>
           <w:p>
             <w:pPr>
@@ -1668,7 +1856,7 @@
         </w:tc>
         <w:tc>
           <w:tcPr>
-            <w:tcW w:w="1116" w:type="dxa"/>
+            <w:tcW w:w="1088" w:type="dxa"/>
           </w:tcPr>
           <w:p>
             <w:pPr>
@@ -1684,7 +1872,7 @@
       <w:tr>
         <w:tc>
           <w:tcPr>
-            <w:tcW w:w="1914" w:type="dxa"/>
+            <w:tcW w:w="1865" w:type="dxa"/>
           </w:tcPr>
           <w:p>
             <w:pPr>
@@ -1698,7 +1886,7 @@
         </w:tc>
         <w:tc>
           <w:tcPr>
-            <w:tcW w:w="6328" w:type="dxa"/>
+            <w:tcW w:w="6405" w:type="dxa"/>
           </w:tcPr>
           <w:p>
             <w:pPr>
@@ -1760,7 +1948,7 @@
         </w:tc>
         <w:tc>
           <w:tcPr>
-            <w:tcW w:w="1116" w:type="dxa"/>
+            <w:tcW w:w="1088" w:type="dxa"/>
           </w:tcPr>
           <w:p>
             <w:pPr>
@@ -1779,7 +1967,7 @@
         <w:pStyle w:val="BodyText"/>
       </w:pPr>
       <w:r>
-        <w:t xml:space="preserve">Settings that keep it at 15 minutes: in the deck options for the team deck, set new cards per day to about 10. If reviews take more than 20 minutes for 3 days in a row, cut new cards to 5 until it settles. Anki tags a card</w:t>
+        <w:t xml:space="preserve">Settings that keep it at 15 minutes: the setup above (10 new cards a day from the current unit, reviews only on the top deck). If reviews take more than 20 minutes for 3 days in a row, cut new cards to 5 until it settles. Anki tags a card</w:t>
       </w:r>
       <w:r>
         <w:t xml:space="preserve"> </w:t>
@@ -1812,8 +2000,8 @@
         <w:t xml:space="preserve">and rewrite them.</w:t>
       </w:r>
     </w:p>
-    <w:bookmarkEnd w:id="24"/>
-    <w:bookmarkStart w:id="25" w:name="adding-your-own-cards-in-a-separate-deck"/>
+    <w:bookmarkEnd w:id="25"/>
+    <w:bookmarkStart w:id="26" w:name="adding-your-own-cards-in-a-separate-deck"/>
     <w:p>
       <w:pPr>
         <w:pStyle w:val="Heading2"/>
@@ -1826,7 +2014,7 @@
       <w:pPr>
         <w:numPr>
           <w:ilvl w:val="0"/>
-          <w:numId w:val="1005"/>
+          <w:numId w:val="1006"/>
         </w:numPr>
         <w:pStyle w:val="Compact"/>
       </w:pPr>
@@ -1848,7 +2036,7 @@
       <w:pPr>
         <w:numPr>
           <w:ilvl w:val="0"/>
-          <w:numId w:val="1005"/>
+          <w:numId w:val="1006"/>
         </w:numPr>
         <w:pStyle w:val="Compact"/>
       </w:pPr>
@@ -1870,7 +2058,7 @@
       <w:pPr>
         <w:numPr>
           <w:ilvl w:val="0"/>
-          <w:numId w:val="1005"/>
+          <w:numId w:val="1006"/>
         </w:numPr>
         <w:pStyle w:val="Compact"/>
       </w:pPr>
@@ -1919,7 +2107,7 @@
       <w:pPr>
         <w:numPr>
           <w:ilvl w:val="0"/>
-          <w:numId w:val="1005"/>
+          <w:numId w:val="1006"/>
         </w:numPr>
         <w:pStyle w:val="Compact"/>
       </w:pPr>
@@ -1941,7 +2129,7 @@
       <w:pPr>
         <w:numPr>
           <w:ilvl w:val="0"/>
-          <w:numId w:val="1005"/>
+          <w:numId w:val="1006"/>
         </w:numPr>
         <w:pStyle w:val="Compact"/>
       </w:pPr>
@@ -1959,8 +2147,8 @@
         <w:t xml:space="preserve">once a week, swap 5 new cards with the other hire and check each other's facts. The Manager's milestone spot check counts errors.</w:t>
       </w:r>
     </w:p>
-    <w:bookmarkEnd w:id="25"/>
-    <w:bookmarkStart w:id="26" w:name="caution-ankiweb-sync"/>
+    <w:bookmarkEnd w:id="26"/>
+    <w:bookmarkStart w:id="27" w:name="caution-ankiweb-sync"/>
     <w:p>
       <w:pPr>
         <w:pStyle w:val="Heading2"/>
@@ -1973,7 +2161,7 @@
       <w:pPr>
         <w:numPr>
           <w:ilvl w:val="0"/>
-          <w:numId w:val="1006"/>
+          <w:numId w:val="1007"/>
         </w:numPr>
         <w:pStyle w:val="Compact"/>
       </w:pPr>
@@ -1985,7 +2173,7 @@
       <w:pPr>
         <w:numPr>
           <w:ilvl w:val="0"/>
-          <w:numId w:val="1006"/>
+          <w:numId w:val="1007"/>
         </w:numPr>
         <w:pStyle w:val="Compact"/>
       </w:pPr>
@@ -1997,7 +2185,7 @@
       <w:pPr>
         <w:numPr>
           <w:ilvl w:val="0"/>
-          <w:numId w:val="1006"/>
+          <w:numId w:val="1007"/>
         </w:numPr>
         <w:pStyle w:val="Compact"/>
       </w:pPr>
@@ -2034,7 +2222,7 @@
       <w:pPr>
         <w:numPr>
           <w:ilvl w:val="0"/>
-          <w:numId w:val="1006"/>
+          <w:numId w:val="1007"/>
         </w:numPr>
         <w:pStyle w:val="Compact"/>
       </w:pPr>
@@ -2042,8 +2230,8 @@
         <w:t xml:space="preserve">If you want to study the generic team deck on your phone, ask the Manager first. The only safe set-up is a second Anki profile (File &gt; Switch Profile) that holds the team deck only and is the only profile linked to your AnkiWeb account. Never link two profiles to the same AnkiWeb account: the Anki manual warns this loses data.</w:t>
       </w:r>
     </w:p>
-    <w:bookmarkEnd w:id="26"/>
-    <w:bookmarkStart w:id="27" w:name="X71b78af80e8ba50b8f50ada172148c088b2c3ad"/>
+    <w:bookmarkEnd w:id="27"/>
+    <w:bookmarkStart w:id="28" w:name="X71b78af80e8ba50b8f50ada172148c088b2c3ad"/>
     <w:p>
       <w:pPr>
         <w:pStyle w:val="Heading2"/>
@@ -2064,7 +2252,7 @@
       <w:pPr>
         <w:numPr>
           <w:ilvl w:val="0"/>
-          <w:numId w:val="1007"/>
+          <w:numId w:val="1008"/>
         </w:numPr>
         <w:pStyle w:val="Compact"/>
       </w:pPr>
@@ -2086,7 +2274,7 @@
       <w:pPr>
         <w:numPr>
           <w:ilvl w:val="0"/>
-          <w:numId w:val="1007"/>
+          <w:numId w:val="1008"/>
         </w:numPr>
         <w:pStyle w:val="Compact"/>
       </w:pPr>
@@ -2108,7 +2296,7 @@
       <w:pPr>
         <w:numPr>
           <w:ilvl w:val="0"/>
-          <w:numId w:val="1007"/>
+          <w:numId w:val="1008"/>
         </w:numPr>
         <w:pStyle w:val="Compact"/>
       </w:pPr>
@@ -2130,7 +2318,7 @@
       <w:pPr>
         <w:numPr>
           <w:ilvl w:val="0"/>
-          <w:numId w:val="1007"/>
+          <w:numId w:val="1008"/>
         </w:numPr>
         <w:pStyle w:val="Compact"/>
       </w:pPr>
@@ -2152,7 +2340,7 @@
       <w:pPr>
         <w:numPr>
           <w:ilvl w:val="0"/>
-          <w:numId w:val="1007"/>
+          <w:numId w:val="1008"/>
         </w:numPr>
         <w:pStyle w:val="Compact"/>
       </w:pPr>
@@ -2160,8 +2348,8 @@
         <w:t xml:space="preserve">When a fact changes, fix it in the shared workbook first, then in Anki, and tell the other hire.</w:t>
       </w:r>
     </w:p>
-    <w:bookmarkEnd w:id="27"/>
-    <w:bookmarkStart w:id="28" w:name="quality-checklist-for-each-card"/>
+    <w:bookmarkEnd w:id="28"/>
+    <w:bookmarkStart w:id="29" w:name="quality-checklist-for-each-card"/>
     <w:p>
       <w:pPr>
         <w:pStyle w:val="Heading2"/>
@@ -2174,7 +2362,7 @@
       <w:pPr>
         <w:numPr>
           <w:ilvl w:val="0"/>
-          <w:numId w:val="1008"/>
+          <w:numId w:val="1009"/>
         </w:numPr>
         <w:pStyle w:val="Compact"/>
       </w:pPr>
@@ -2186,7 +2374,7 @@
       <w:pPr>
         <w:numPr>
           <w:ilvl w:val="0"/>
-          <w:numId w:val="1008"/>
+          <w:numId w:val="1009"/>
         </w:numPr>
         <w:pStyle w:val="Compact"/>
       </w:pPr>
@@ -2198,7 +2386,7 @@
       <w:pPr>
         <w:numPr>
           <w:ilvl w:val="0"/>
-          <w:numId w:val="1008"/>
+          <w:numId w:val="1009"/>
         </w:numPr>
         <w:pStyle w:val="Compact"/>
       </w:pPr>
@@ -2210,7 +2398,7 @@
       <w:pPr>
         <w:numPr>
           <w:ilvl w:val="0"/>
-          <w:numId w:val="1008"/>
+          <w:numId w:val="1009"/>
         </w:numPr>
         <w:pStyle w:val="Compact"/>
       </w:pPr>
@@ -2222,7 +2410,7 @@
       <w:pPr>
         <w:numPr>
           <w:ilvl w:val="0"/>
-          <w:numId w:val="1008"/>
+          <w:numId w:val="1009"/>
         </w:numPr>
         <w:pStyle w:val="Compact"/>
       </w:pPr>
@@ -2249,7 +2437,7 @@
       <w:pPr>
         <w:numPr>
           <w:ilvl w:val="0"/>
-          <w:numId w:val="1008"/>
+          <w:numId w:val="1009"/>
         </w:numPr>
         <w:pStyle w:val="Compact"/>
       </w:pPr>
@@ -2300,7 +2488,7 @@
       <w:pPr>
         <w:numPr>
           <w:ilvl w:val="0"/>
-          <w:numId w:val="1008"/>
+          <w:numId w:val="1009"/>
         </w:numPr>
         <w:pStyle w:val="Compact"/>
       </w:pPr>
@@ -2308,8 +2496,8 @@
         <w:t xml:space="preserve">☐ My cards are in my own deck only, never in the team deck, with no confidential data.</w:t>
       </w:r>
     </w:p>
-    <w:bookmarkEnd w:id="28"/>
     <w:bookmarkEnd w:id="29"/>
+    <w:bookmarkEnd w:id="30"/>
     <w:sectPr/>
   </w:body>
 </w:document>
@@ -2584,6 +2772,9 @@
     <w:abstractNumId w:val="991"/>
   </w:num>
   <w:num w:numId="1002">
+    <w:abstractNumId w:val="991"/>
+  </w:num>
+  <w:num w:numId="1003">
     <w:abstractNumId w:val="99411"/>
     <w:lvlOverride w:ilvl="0">
       <w:startOverride w:val="1"/>
@@ -2613,13 +2804,13 @@
       <w:startOverride w:val="1"/>
     </w:lvlOverride>
   </w:num>
-  <w:num w:numId="1003">
-    <w:abstractNumId w:val="991"/>
-  </w:num>
   <w:num w:numId="1004">
     <w:abstractNumId w:val="991"/>
   </w:num>
   <w:num w:numId="1005">
+    <w:abstractNumId w:val="991"/>
+  </w:num>
+  <w:num w:numId="1006">
     <w:abstractNumId w:val="99411"/>
     <w:lvlOverride w:ilvl="0">
       <w:startOverride w:val="1"/>
@@ -2649,10 +2840,10 @@
       <w:startOverride w:val="1"/>
     </w:lvlOverride>
   </w:num>
-  <w:num w:numId="1006">
+  <w:num w:numId="1007">
     <w:abstractNumId w:val="991"/>
   </w:num>
-  <w:num w:numId="1007">
+  <w:num w:numId="1008">
     <w:abstractNumId w:val="99411"/>
     <w:lvlOverride w:ilvl="0">
       <w:startOverride w:val="1"/>
@@ -2682,7 +2873,7 @@
       <w:startOverride w:val="1"/>
     </w:lvlOverride>
   </w:num>
-  <w:num w:numId="1008">
+  <w:num w:numId="1009">
     <w:abstractNumId w:val="991"/>
   </w:num>
 </w:numbering>

</xml_diff>